<commit_message>
docs: remove previous-version references, add flowcharts and all marker types
</commit_message>
<xml_diff>
--- a/README.docx
+++ b/README.docx
@@ -47,19 +47,7 @@
     <w:p/>
     <w:p>
       <w:r>
-        <w:t>Este proyecto permite que Informática diseñe un reporte tabular en Microsoft</w:t>
-      </w:r>
-      <w:r>
-        <w:t xml:space="preserve"> </w:t>
-      </w:r>
-      <w:r>
-        <w:t>Word, lo valide localmente y genere el bloque PL/SQL mínimo que Oracle APEX</w:t>
-      </w:r>
-      <w:r>
-        <w:t xml:space="preserve"> </w:t>
-      </w:r>
-      <w:r>
-        <w:t xml:space="preserve">24.2 necesita para descargar PDF o XLSX mediante </w:t>
+        <w:t xml:space="preserve">Este proyecto permite que Informática diseñe un reporte tabular en Microsoft Word, lo valide localmente y genere el bloque PL/SQL mínimo que Oracle APEX 24.2 necesita para descargar PDF o XLSX mediante </w:t>
       </w:r>
       <w:r>
         <w:rPr>
@@ -75,22 +63,7 @@
     </w:p>
     <w:p>
       <w:r>
-        <w:t>Word y Python se usan solamente en la computadora del desarrollador. En el</w:t>
-      </w:r>
-      <w:r>
-        <w:t xml:space="preserve"> </w:t>
-      </w:r>
-      <w:r>
-        <w:t>servidor no se requieren Word, LibreOffice, Python, Docker ni un motor de</w:t>
-      </w:r>
-      <w:r>
-        <w:t xml:space="preserve"> </w:t>
-      </w:r>
-      <w:r>
-        <w:t>impresión adicional. En Oracle se instala una sola vez</w:t>
-      </w:r>
-      <w:r>
-        <w:t xml:space="preserve"> </w:t>
+        <w:t xml:space="preserve">Word y Python se usan solamente en la computadora del desarrollador. En el servidor no se requieren Word, LibreOffice, Python, Docker ni un motor de impresión adicional. En Oracle se instala una sola vez </w:t>
       </w:r>
       <w:r>
         <w:rPr>
@@ -366,10 +339,7 @@
     </w:p>
     <w:p>
       <w:r>
-        <w:t>El SQL debe devolver el texto que se desea imprimir. Para un LOV, use un</w:t>
-      </w:r>
-      <w:r>
-        <w:t xml:space="preserve"> </w:t>
+        <w:t xml:space="preserve">El SQL debe devolver el texto que se desea imprimir. Para un LOV, use un </w:t>
       </w:r>
       <w:r>
         <w:rPr>
@@ -393,6 +363,1110 @@
       </w:r>
     </w:p>
     <w:p>
+      <w:r>
+        <w:t>La plantilla de referencia (</w:t>
+      </w:r>
+      <w:r>
+        <w:rPr>
+          <w:rFonts w:ascii="Consolas" w:hAnsi="Consolas"/>
+          <w:color w:val="233648"/>
+          <w:sz w:val="16"/>
+        </w:rPr>
+        <w:t>templates/</w:t>
+      </w:r>
+      <w:r>
+        <w:t xml:space="preserve"> y </w:t>
+      </w:r>
+      <w:r>
+        <w:rPr>
+          <w:rFonts w:ascii="Consolas" w:hAnsi="Consolas"/>
+          <w:color w:val="233648"/>
+          <w:sz w:val="16"/>
+        </w:rPr>
+        <w:t>examples/entidades.docx</w:t>
+      </w:r>
+      <w:r>
+        <w:t>) usa los cinco tipos de marcador:</w:t>
+      </w:r>
+    </w:p>
+    <w:tbl>
+      <w:tblPr>
+        <w:tblW w:type="auto" w:w="0"/>
+        <w:jc w:val="center"/>
+        <w:tblLook w:firstColumn="1" w:firstRow="1" w:lastColumn="0" w:lastRow="0" w:noHBand="0" w:noVBand="1" w:val="04A0"/>
+      </w:tblPr>
+      <w:tblGrid>
+        <w:gridCol w:w="9972"/>
+      </w:tblGrid>
+      <w:tr>
+        <w:tc>
+          <w:tcPr>
+            <w:tcW w:type="dxa" w:w="9972"/>
+            <w:shd w:fill="F5F7F9"/>
+            <w:tcMar>
+              <w:top w:w="100" w:type="dxa"/>
+              <w:start w:w="140" w:type="dxa"/>
+              <w:bottom w:w="100" w:type="dxa"/>
+              <w:end w:w="140" w:type="dxa"/>
+            </w:tcMar>
+          </w:tcPr>
+          <w:p>
+            <w:pPr>
+              <w:keepLines/>
+              <w:spacing w:after="0"/>
+            </w:pPr>
+            <w:r>
+              <w:rPr>
+                <w:rFonts w:ascii="Consolas" w:hAnsi="Consolas"/>
+                <w:color w:val="233648"/>
+                <w:sz w:val="16"/>
+              </w:rPr>
+              <w:t>{{REPORT_TITLE}}                  &lt;- título: párrafo previo a la tabla</w:t>
+            </w:r>
+            <w:r>
+              <w:br/>
+            </w:r>
+            <w:r>
+              <w:rPr>
+                <w:rFonts w:ascii="Consolas" w:hAnsi="Consolas"/>
+                <w:color w:val="233648"/>
+                <w:sz w:val="16"/>
+              </w:rPr>
+              <w:t>Unidad: {{FIELD:UNIDAD}}          &lt;- campo escalar en la misma zona del título</w:t>
+            </w:r>
+            <w:r>
+              <w:br/>
+            </w:r>
+            <w:r>
+              <w:br/>
+            </w:r>
+            <w:r>
+              <w:rPr>
+                <w:rFonts w:ascii="Consolas" w:hAnsi="Consolas"/>
+                <w:color w:val="233648"/>
+                <w:sz w:val="16"/>
+              </w:rPr>
+              <w:t>DNI              Nombre completo   ...   &lt;- fila 1: etiquetas literales</w:t>
+            </w:r>
+            <w:r>
+              <w:br/>
+            </w:r>
+            <w:r>
+              <w:rPr>
+                <w:rFonts w:ascii="Consolas" w:hAnsi="Consolas"/>
+                <w:color w:val="233648"/>
+                <w:sz w:val="16"/>
+              </w:rPr>
+              <w:t>{{COLUMN:VDNI}}  {{COLUMN:VNOM}}   ...   &lt;- fila 2: un alias SQL por celda</w:t>
+            </w:r>
+            <w:r>
+              <w:br/>
+            </w:r>
+            <w:r>
+              <w:br/>
+            </w:r>
+            <w:r>
+              <w:rPr>
+                <w:rFonts w:ascii="Consolas" w:hAnsi="Consolas"/>
+                <w:color w:val="233648"/>
+                <w:sz w:val="16"/>
+              </w:rPr>
+              <w:t>Usuario: {{APP_USER}} | Fecha: {{GENERATED_AT}}   &lt;- pie de página de Word</w:t>
+            </w:r>
+          </w:p>
+        </w:tc>
+      </w:tr>
+    </w:tbl>
+    <w:p>
+      <w:pPr>
+        <w:pStyle w:val="Heading1"/>
+        <w:keepNext/>
+      </w:pPr>
+      <w:r>
+        <w:t>Flujo de trabajo</w:t>
+      </w:r>
+    </w:p>
+    <w:tbl>
+      <w:tblPr>
+        <w:tblW w:type="auto" w:w="0"/>
+        <w:jc w:val="center"/>
+        <w:tblLayout w:type="fixed"/>
+        <w:tblLook w:firstColumn="1" w:firstRow="1" w:lastColumn="0" w:lastRow="0" w:noHBand="0" w:noVBand="1" w:val="04A0"/>
+        <w:tblBorders>
+          <w:top w:val="nil"/>
+          <w:left w:val="nil"/>
+          <w:bottom w:val="nil"/>
+          <w:right w:val="nil"/>
+          <w:insideH w:val="nil"/>
+          <w:insideV w:val="nil"/>
+        </w:tblBorders>
+      </w:tblPr>
+      <w:tblGrid>
+        <w:gridCol w:w="4986"/>
+        <w:gridCol w:w="4986"/>
+      </w:tblGrid>
+      <w:tr>
+        <w:trPr>
+          <w:cantSplit w:val="true"/>
+        </w:trPr>
+        <w:tc>
+          <w:tcPr>
+            <w:tcW w:type="dxa" w:w="1871"/>
+            <w:vAlign w:val="center"/>
+            <w:tcMar>
+              <w:top w:w="40" w:type="dxa"/>
+              <w:start w:w="60" w:type="dxa"/>
+              <w:bottom w:w="40" w:type="dxa"/>
+              <w:end w:w="140" w:type="dxa"/>
+            </w:tcMar>
+          </w:tcPr>
+          <w:p>
+            <w:pPr>
+              <w:keepNext/>
+              <w:spacing w:after="0"/>
+              <w:jc w:val="right"/>
+            </w:pPr>
+            <w:r>
+              <w:rPr>
+                <w:rFonts w:ascii="Aptos" w:hAnsi="Aptos"/>
+                <w:b/>
+                <w:color w:val="4A5563"/>
+                <w:sz w:val="14"/>
+              </w:rPr>
+              <w:t>INFORMÁTICA</w:t>
+            </w:r>
+          </w:p>
+        </w:tc>
+        <w:tc>
+          <w:tcPr>
+            <w:tcW w:type="dxa" w:w="6350"/>
+            <w:vAlign w:val="center"/>
+            <w:shd w:fill="E8EDF2"/>
+            <w:tcBorders>
+              <w:top w:val="single" w:sz="8" w:space="0" w:color="283848"/>
+              <w:left w:val="single" w:sz="8" w:space="0" w:color="283848"/>
+              <w:bottom w:val="single" w:sz="8" w:space="0" w:color="283848"/>
+              <w:right w:val="single" w:sz="8" w:space="0" w:color="283848"/>
+            </w:tcBorders>
+            <w:tcMar>
+              <w:top w:w="70" w:type="dxa"/>
+              <w:start w:w="140" w:type="dxa"/>
+              <w:bottom w:w="70" w:type="dxa"/>
+              <w:end w:w="140" w:type="dxa"/>
+            </w:tcMar>
+          </w:tcPr>
+          <w:p>
+            <w:pPr>
+              <w:keepNext/>
+              <w:spacing w:after="0"/>
+              <w:jc w:val="center"/>
+            </w:pPr>
+            <w:r>
+              <w:rPr>
+                <w:b/>
+                <w:color w:val="283848"/>
+                <w:sz w:val="17"/>
+              </w:rPr>
+              <w:t>Diseñar la plantilla Word</w:t>
+            </w:r>
+          </w:p>
+          <w:p>
+            <w:pPr>
+              <w:keepNext/>
+              <w:spacing w:after="0"/>
+              <w:jc w:val="center"/>
+            </w:pPr>
+            <w:r>
+              <w:rPr>
+                <w:sz w:val="15"/>
+              </w:rPr>
+              <w:t>título, tabla de dos filas y pie con marcadores {{...}}</w:t>
+            </w:r>
+          </w:p>
+        </w:tc>
+      </w:tr>
+      <w:tr>
+        <w:trPr>
+          <w:cantSplit w:val="true"/>
+        </w:trPr>
+        <w:tc>
+          <w:tcPr>
+            <w:tcW w:type="dxa" w:w="1871"/>
+          </w:tcPr>
+          <w:p>
+            <w:pPr>
+              <w:keepNext/>
+            </w:pPr>
+          </w:p>
+        </w:tc>
+        <w:tc>
+          <w:tcPr>
+            <w:tcW w:type="dxa" w:w="6350"/>
+          </w:tcPr>
+          <w:p>
+            <w:pPr>
+              <w:keepNext/>
+              <w:spacing w:after="0" w:line="216" w:lineRule="auto"/>
+              <w:jc w:val="center"/>
+            </w:pPr>
+            <w:r>
+              <w:rPr>
+                <w:color w:val="4A5563"/>
+                <w:sz w:val="18"/>
+              </w:rPr>
+              <w:t>▼</w:t>
+            </w:r>
+          </w:p>
+        </w:tc>
+      </w:tr>
+      <w:tr>
+        <w:trPr>
+          <w:cantSplit w:val="true"/>
+        </w:trPr>
+        <w:tc>
+          <w:tcPr>
+            <w:tcW w:type="dxa" w:w="1871"/>
+            <w:vAlign w:val="center"/>
+            <w:tcMar>
+              <w:top w:w="40" w:type="dxa"/>
+              <w:start w:w="60" w:type="dxa"/>
+              <w:bottom w:w="40" w:type="dxa"/>
+              <w:end w:w="140" w:type="dxa"/>
+            </w:tcMar>
+          </w:tcPr>
+          <w:p>
+            <w:pPr>
+              <w:keepNext/>
+              <w:spacing w:after="0"/>
+              <w:jc w:val="right"/>
+            </w:pPr>
+            <w:r>
+              <w:rPr>
+                <w:rFonts w:ascii="Aptos" w:hAnsi="Aptos"/>
+                <w:b/>
+                <w:color w:val="4A5563"/>
+                <w:sz w:val="14"/>
+              </w:rPr>
+              <w:t>COMPILADOR</w:t>
+            </w:r>
+          </w:p>
+        </w:tc>
+        <w:tc>
+          <w:tcPr>
+            <w:tcW w:type="dxa" w:w="6350"/>
+            <w:vAlign w:val="center"/>
+            <w:shd w:fill="E8EDF2"/>
+            <w:tcBorders>
+              <w:top w:val="single" w:sz="8" w:space="0" w:color="283848"/>
+              <w:left w:val="single" w:sz="8" w:space="0" w:color="283848"/>
+              <w:bottom w:val="single" w:sz="8" w:space="0" w:color="283848"/>
+              <w:right w:val="single" w:sz="8" w:space="0" w:color="283848"/>
+            </w:tcBorders>
+            <w:tcMar>
+              <w:top w:w="70" w:type="dxa"/>
+              <w:start w:w="140" w:type="dxa"/>
+              <w:bottom w:w="70" w:type="dxa"/>
+              <w:end w:w="140" w:type="dxa"/>
+            </w:tcMar>
+          </w:tcPr>
+          <w:p>
+            <w:pPr>
+              <w:keepNext/>
+              <w:spacing w:after="0"/>
+              <w:jc w:val="center"/>
+            </w:pPr>
+            <w:r>
+              <w:rPr>
+                <w:b/>
+                <w:color w:val="283848"/>
+                <w:sz w:val="17"/>
+              </w:rPr>
+              <w:t>Nuevo proyecto desde DOCX</w:t>
+            </w:r>
+          </w:p>
+          <w:p>
+            <w:pPr>
+              <w:keepNext/>
+              <w:spacing w:after="0"/>
+              <w:jc w:val="center"/>
+            </w:pPr>
+            <w:r>
+              <w:rPr>
+                <w:sz w:val="15"/>
+              </w:rPr>
+              <w:t>crea automáticamente &lt;nombre&gt;.report.json y &lt;nombre&gt;.sql</w:t>
+            </w:r>
+          </w:p>
+        </w:tc>
+      </w:tr>
+      <w:tr>
+        <w:trPr>
+          <w:cantSplit w:val="true"/>
+        </w:trPr>
+        <w:tc>
+          <w:tcPr>
+            <w:tcW w:type="dxa" w:w="1871"/>
+          </w:tcPr>
+          <w:p>
+            <w:pPr>
+              <w:keepNext/>
+            </w:pPr>
+          </w:p>
+        </w:tc>
+        <w:tc>
+          <w:tcPr>
+            <w:tcW w:type="dxa" w:w="6350"/>
+          </w:tcPr>
+          <w:p>
+            <w:pPr>
+              <w:keepNext/>
+              <w:spacing w:after="0" w:line="216" w:lineRule="auto"/>
+              <w:jc w:val="center"/>
+            </w:pPr>
+            <w:r>
+              <w:rPr>
+                <w:color w:val="4A5563"/>
+                <w:sz w:val="18"/>
+              </w:rPr>
+              <w:t>▼</w:t>
+            </w:r>
+          </w:p>
+        </w:tc>
+      </w:tr>
+      <w:tr>
+        <w:trPr>
+          <w:cantSplit w:val="true"/>
+        </w:trPr>
+        <w:tc>
+          <w:tcPr>
+            <w:tcW w:type="dxa" w:w="1871"/>
+            <w:vAlign w:val="center"/>
+            <w:tcMar>
+              <w:top w:w="40" w:type="dxa"/>
+              <w:start w:w="60" w:type="dxa"/>
+              <w:bottom w:w="40" w:type="dxa"/>
+              <w:end w:w="140" w:type="dxa"/>
+            </w:tcMar>
+          </w:tcPr>
+          <w:p>
+            <w:pPr>
+              <w:keepNext/>
+              <w:spacing w:after="0"/>
+              <w:jc w:val="right"/>
+            </w:pPr>
+            <w:r>
+              <w:rPr>
+                <w:rFonts w:ascii="Aptos" w:hAnsi="Aptos"/>
+                <w:b/>
+                <w:color w:val="4A5563"/>
+                <w:sz w:val="14"/>
+              </w:rPr>
+              <w:t>INFORMÁTICA</w:t>
+            </w:r>
+          </w:p>
+        </w:tc>
+        <w:tc>
+          <w:tcPr>
+            <w:tcW w:type="dxa" w:w="6350"/>
+            <w:vAlign w:val="center"/>
+            <w:shd w:fill="E8EDF2"/>
+            <w:tcBorders>
+              <w:top w:val="single" w:sz="8" w:space="0" w:color="283848"/>
+              <w:left w:val="single" w:sz="8" w:space="0" w:color="283848"/>
+              <w:bottom w:val="single" w:sz="8" w:space="0" w:color="283848"/>
+              <w:right w:val="single" w:sz="8" w:space="0" w:color="283848"/>
+            </w:tcBorders>
+            <w:tcMar>
+              <w:top w:w="70" w:type="dxa"/>
+              <w:start w:w="140" w:type="dxa"/>
+              <w:bottom w:w="70" w:type="dxa"/>
+              <w:end w:w="140" w:type="dxa"/>
+            </w:tcMar>
+          </w:tcPr>
+          <w:p>
+            <w:pPr>
+              <w:keepNext/>
+              <w:spacing w:after="0"/>
+              <w:jc w:val="center"/>
+            </w:pPr>
+            <w:r>
+              <w:rPr>
+                <w:b/>
+                <w:color w:val="283848"/>
+                <w:sz w:val="17"/>
+              </w:rPr>
+              <w:t>Ajustar SQL y proyecto</w:t>
+            </w:r>
+          </w:p>
+          <w:p>
+            <w:pPr>
+              <w:keepNext/>
+              <w:spacing w:after="0"/>
+              <w:jc w:val="center"/>
+            </w:pPr>
+            <w:r>
+              <w:rPr>
+                <w:sz w:val="15"/>
+              </w:rPr>
+              <w:t>tablas reales, filtros y anchos; editables a mano en cualquier momento</w:t>
+            </w:r>
+          </w:p>
+        </w:tc>
+      </w:tr>
+      <w:tr>
+        <w:trPr>
+          <w:cantSplit w:val="true"/>
+        </w:trPr>
+        <w:tc>
+          <w:tcPr>
+            <w:tcW w:type="dxa" w:w="1871"/>
+          </w:tcPr>
+          <w:p>
+            <w:pPr>
+              <w:keepNext/>
+            </w:pPr>
+          </w:p>
+        </w:tc>
+        <w:tc>
+          <w:tcPr>
+            <w:tcW w:type="dxa" w:w="6350"/>
+          </w:tcPr>
+          <w:p>
+            <w:pPr>
+              <w:keepNext/>
+              <w:spacing w:after="0" w:line="216" w:lineRule="auto"/>
+              <w:jc w:val="center"/>
+            </w:pPr>
+            <w:r>
+              <w:rPr>
+                <w:color w:val="4A5563"/>
+                <w:sz w:val="18"/>
+              </w:rPr>
+              <w:t>▼</w:t>
+            </w:r>
+          </w:p>
+        </w:tc>
+      </w:tr>
+      <w:tr>
+        <w:trPr>
+          <w:cantSplit w:val="true"/>
+        </w:trPr>
+        <w:tc>
+          <w:tcPr>
+            <w:tcW w:type="dxa" w:w="1871"/>
+            <w:vAlign w:val="center"/>
+            <w:tcMar>
+              <w:top w:w="40" w:type="dxa"/>
+              <w:start w:w="60" w:type="dxa"/>
+              <w:bottom w:w="40" w:type="dxa"/>
+              <w:end w:w="140" w:type="dxa"/>
+            </w:tcMar>
+          </w:tcPr>
+          <w:p>
+            <w:pPr>
+              <w:keepNext/>
+              <w:spacing w:after="0"/>
+              <w:jc w:val="right"/>
+            </w:pPr>
+            <w:r>
+              <w:rPr>
+                <w:rFonts w:ascii="Aptos" w:hAnsi="Aptos"/>
+                <w:b/>
+                <w:color w:val="4A5563"/>
+                <w:sz w:val="14"/>
+              </w:rPr>
+              <w:t>COMPILADOR</w:t>
+            </w:r>
+          </w:p>
+        </w:tc>
+        <w:tc>
+          <w:tcPr>
+            <w:tcW w:type="dxa" w:w="6350"/>
+            <w:vAlign w:val="center"/>
+            <w:shd w:fill="E8EDF2"/>
+            <w:tcBorders>
+              <w:top w:val="single" w:sz="8" w:space="0" w:color="283848"/>
+              <w:left w:val="single" w:sz="8" w:space="0" w:color="283848"/>
+              <w:bottom w:val="single" w:sz="8" w:space="0" w:color="283848"/>
+              <w:right w:val="single" w:sz="8" w:space="0" w:color="283848"/>
+            </w:tcBorders>
+            <w:tcMar>
+              <w:top w:w="70" w:type="dxa"/>
+              <w:start w:w="140" w:type="dxa"/>
+              <w:bottom w:w="70" w:type="dxa"/>
+              <w:end w:w="140" w:type="dxa"/>
+            </w:tcMar>
+          </w:tcPr>
+          <w:p>
+            <w:pPr>
+              <w:keepNext/>
+              <w:spacing w:after="0"/>
+              <w:jc w:val="center"/>
+            </w:pPr>
+            <w:r>
+              <w:rPr>
+                <w:b/>
+                <w:color w:val="283848"/>
+                <w:sz w:val="17"/>
+              </w:rPr>
+              <w:t>Validar</w:t>
+            </w:r>
+          </w:p>
+          <w:p>
+            <w:pPr>
+              <w:keepNext/>
+              <w:spacing w:after="0"/>
+              <w:jc w:val="center"/>
+            </w:pPr>
+            <w:r>
+              <w:rPr>
+                <w:sz w:val="15"/>
+              </w:rPr>
+              <w:t>revisa DOCX, SQL y proyecto sin escribir archivos</w:t>
+            </w:r>
+          </w:p>
+        </w:tc>
+      </w:tr>
+      <w:tr>
+        <w:trPr>
+          <w:cantSplit w:val="true"/>
+        </w:trPr>
+        <w:tc>
+          <w:tcPr>
+            <w:tcW w:type="dxa" w:w="1871"/>
+          </w:tcPr>
+          <w:p>
+            <w:pPr>
+              <w:keepNext/>
+            </w:pPr>
+          </w:p>
+        </w:tc>
+        <w:tc>
+          <w:tcPr>
+            <w:tcW w:type="dxa" w:w="6350"/>
+          </w:tcPr>
+          <w:p>
+            <w:pPr>
+              <w:keepNext/>
+              <w:spacing w:after="0" w:line="216" w:lineRule="auto"/>
+              <w:jc w:val="center"/>
+            </w:pPr>
+            <w:r>
+              <w:rPr>
+                <w:color w:val="4A5563"/>
+                <w:sz w:val="18"/>
+              </w:rPr>
+              <w:t>▼</w:t>
+            </w:r>
+          </w:p>
+        </w:tc>
+      </w:tr>
+      <w:tr>
+        <w:trPr>
+          <w:cantSplit w:val="true"/>
+        </w:trPr>
+        <w:tc>
+          <w:tcPr>
+            <w:tcW w:type="dxa" w:w="1871"/>
+            <w:vAlign w:val="center"/>
+            <w:tcMar>
+              <w:top w:w="40" w:type="dxa"/>
+              <w:start w:w="60" w:type="dxa"/>
+              <w:bottom w:w="40" w:type="dxa"/>
+              <w:end w:w="140" w:type="dxa"/>
+            </w:tcMar>
+          </w:tcPr>
+          <w:p>
+            <w:pPr>
+              <w:keepNext/>
+              <w:spacing w:after="0"/>
+              <w:jc w:val="right"/>
+            </w:pPr>
+            <w:r>
+              <w:rPr>
+                <w:rFonts w:ascii="Aptos" w:hAnsi="Aptos"/>
+                <w:b/>
+                <w:color w:val="B7791F"/>
+                <w:sz w:val="14"/>
+              </w:rPr>
+              <w:t>COMPILADOR</w:t>
+            </w:r>
+          </w:p>
+        </w:tc>
+        <w:tc>
+          <w:tcPr>
+            <w:tcW w:type="dxa" w:w="6350"/>
+            <w:vAlign w:val="center"/>
+            <w:shd w:fill="FDF3E1"/>
+            <w:tcBorders>
+              <w:top w:val="dashed" w:sz="10" w:space="0" w:color="B7791F"/>
+              <w:left w:val="dashed" w:sz="10" w:space="0" w:color="B7791F"/>
+              <w:bottom w:val="dashed" w:sz="10" w:space="0" w:color="B7791F"/>
+              <w:right w:val="dashed" w:sz="10" w:space="0" w:color="B7791F"/>
+            </w:tcBorders>
+            <w:tcMar>
+              <w:top w:w="70" w:type="dxa"/>
+              <w:start w:w="140" w:type="dxa"/>
+              <w:bottom w:w="70" w:type="dxa"/>
+              <w:end w:w="140" w:type="dxa"/>
+            </w:tcMar>
+          </w:tcPr>
+          <w:p>
+            <w:pPr>
+              <w:keepNext/>
+              <w:spacing w:after="0"/>
+              <w:jc w:val="center"/>
+            </w:pPr>
+            <w:r>
+              <w:rPr>
+                <w:b/>
+                <w:color w:val="B7791F"/>
+                <w:sz w:val="17"/>
+              </w:rPr>
+              <w:t>◆ ¿Sin errores?</w:t>
+            </w:r>
+          </w:p>
+          <w:p>
+            <w:pPr>
+              <w:keepNext/>
+              <w:spacing w:after="0"/>
+              <w:jc w:val="center"/>
+            </w:pPr>
+            <w:r>
+              <w:rPr>
+                <w:sz w:val="15"/>
+              </w:rPr>
+              <w:t>No: corregir según el código de diagnóstico y validar otra vez</w:t>
+            </w:r>
+          </w:p>
+        </w:tc>
+      </w:tr>
+      <w:tr>
+        <w:trPr>
+          <w:cantSplit w:val="true"/>
+        </w:trPr>
+        <w:tc>
+          <w:tcPr>
+            <w:tcW w:type="dxa" w:w="1871"/>
+          </w:tcPr>
+          <w:p>
+            <w:pPr>
+              <w:keepNext/>
+            </w:pPr>
+          </w:p>
+        </w:tc>
+        <w:tc>
+          <w:tcPr>
+            <w:tcW w:type="dxa" w:w="6350"/>
+          </w:tcPr>
+          <w:p>
+            <w:pPr>
+              <w:keepNext/>
+              <w:spacing w:after="0" w:line="216" w:lineRule="auto"/>
+              <w:jc w:val="center"/>
+            </w:pPr>
+            <w:r>
+              <w:rPr>
+                <w:color w:val="4A5563"/>
+                <w:sz w:val="18"/>
+              </w:rPr>
+              <w:t>▼</w:t>
+            </w:r>
+            <w:r>
+              <w:rPr>
+                <w:b/>
+                <w:color w:val="B7791F"/>
+                <w:sz w:val="15"/>
+              </w:rPr>
+              <w:t xml:space="preserve">  Sí</w:t>
+            </w:r>
+          </w:p>
+        </w:tc>
+      </w:tr>
+      <w:tr>
+        <w:trPr>
+          <w:cantSplit w:val="true"/>
+        </w:trPr>
+        <w:tc>
+          <w:tcPr>
+            <w:tcW w:type="dxa" w:w="1871"/>
+            <w:vAlign w:val="center"/>
+            <w:tcMar>
+              <w:top w:w="40" w:type="dxa"/>
+              <w:start w:w="60" w:type="dxa"/>
+              <w:bottom w:w="40" w:type="dxa"/>
+              <w:end w:w="140" w:type="dxa"/>
+            </w:tcMar>
+          </w:tcPr>
+          <w:p>
+            <w:pPr>
+              <w:keepNext/>
+              <w:spacing w:after="0"/>
+              <w:jc w:val="right"/>
+            </w:pPr>
+            <w:r>
+              <w:rPr>
+                <w:rFonts w:ascii="Aptos" w:hAnsi="Aptos"/>
+                <w:b/>
+                <w:color w:val="4A5563"/>
+                <w:sz w:val="14"/>
+              </w:rPr>
+              <w:t>COMPILADOR</w:t>
+            </w:r>
+          </w:p>
+        </w:tc>
+        <w:tc>
+          <w:tcPr>
+            <w:tcW w:type="dxa" w:w="6350"/>
+            <w:vAlign w:val="center"/>
+            <w:shd w:fill="E8EDF2"/>
+            <w:tcBorders>
+              <w:top w:val="single" w:sz="8" w:space="0" w:color="283848"/>
+              <w:left w:val="single" w:sz="8" w:space="0" w:color="283848"/>
+              <w:bottom w:val="single" w:sz="8" w:space="0" w:color="283848"/>
+              <w:right w:val="single" w:sz="8" w:space="0" w:color="283848"/>
+            </w:tcBorders>
+            <w:tcMar>
+              <w:top w:w="70" w:type="dxa"/>
+              <w:start w:w="140" w:type="dxa"/>
+              <w:bottom w:w="70" w:type="dxa"/>
+              <w:end w:w="140" w:type="dxa"/>
+            </w:tcMar>
+          </w:tcPr>
+          <w:p>
+            <w:pPr>
+              <w:keepNext/>
+              <w:spacing w:after="0"/>
+              <w:jc w:val="center"/>
+            </w:pPr>
+            <w:r>
+              <w:rPr>
+                <w:b/>
+                <w:color w:val="283848"/>
+                <w:sz w:val="17"/>
+              </w:rPr>
+              <w:t>Compilar</w:t>
+            </w:r>
+          </w:p>
+          <w:p>
+            <w:pPr>
+              <w:keepNext/>
+              <w:spacing w:after="0"/>
+              <w:jc w:val="center"/>
+            </w:pPr>
+            <w:r>
+              <w:rPr>
+                <w:sz w:val="15"/>
+              </w:rPr>
+              <w:t>genera automáticamente template.json, validation.json y apex_process.sql</w:t>
+            </w:r>
+          </w:p>
+        </w:tc>
+      </w:tr>
+      <w:tr>
+        <w:trPr>
+          <w:cantSplit w:val="true"/>
+        </w:trPr>
+        <w:tc>
+          <w:tcPr>
+            <w:tcW w:type="dxa" w:w="1871"/>
+          </w:tcPr>
+          <w:p>
+            <w:pPr>
+              <w:keepNext/>
+            </w:pPr>
+          </w:p>
+        </w:tc>
+        <w:tc>
+          <w:tcPr>
+            <w:tcW w:type="dxa" w:w="6350"/>
+          </w:tcPr>
+          <w:p>
+            <w:pPr>
+              <w:keepNext/>
+              <w:spacing w:after="0" w:line="216" w:lineRule="auto"/>
+              <w:jc w:val="center"/>
+            </w:pPr>
+            <w:r>
+              <w:rPr>
+                <w:color w:val="4A5563"/>
+                <w:sz w:val="18"/>
+              </w:rPr>
+              <w:t>▼</w:t>
+            </w:r>
+          </w:p>
+        </w:tc>
+      </w:tr>
+      <w:tr>
+        <w:trPr>
+          <w:cantSplit w:val="true"/>
+        </w:trPr>
+        <w:tc>
+          <w:tcPr>
+            <w:tcW w:type="dxa" w:w="1871"/>
+            <w:vAlign w:val="center"/>
+            <w:tcMar>
+              <w:top w:w="40" w:type="dxa"/>
+              <w:start w:w="60" w:type="dxa"/>
+              <w:bottom w:w="40" w:type="dxa"/>
+              <w:end w:w="140" w:type="dxa"/>
+            </w:tcMar>
+          </w:tcPr>
+          <w:p>
+            <w:pPr>
+              <w:keepNext/>
+              <w:spacing w:after="0"/>
+              <w:jc w:val="right"/>
+            </w:pPr>
+            <w:r>
+              <w:rPr>
+                <w:rFonts w:ascii="Aptos" w:hAnsi="Aptos"/>
+                <w:b/>
+                <w:color w:val="4A5563"/>
+                <w:sz w:val="14"/>
+              </w:rPr>
+              <w:t>APEX</w:t>
+            </w:r>
+          </w:p>
+        </w:tc>
+        <w:tc>
+          <w:tcPr>
+            <w:tcW w:type="dxa" w:w="6350"/>
+            <w:vAlign w:val="center"/>
+            <w:shd w:fill="E8EDF2"/>
+            <w:tcBorders>
+              <w:top w:val="single" w:sz="8" w:space="0" w:color="283848"/>
+              <w:left w:val="single" w:sz="8" w:space="0" w:color="283848"/>
+              <w:bottom w:val="single" w:sz="8" w:space="0" w:color="283848"/>
+              <w:right w:val="single" w:sz="8" w:space="0" w:color="283848"/>
+            </w:tcBorders>
+            <w:tcMar>
+              <w:top w:w="70" w:type="dxa"/>
+              <w:start w:w="140" w:type="dxa"/>
+              <w:bottom w:w="70" w:type="dxa"/>
+              <w:end w:w="140" w:type="dxa"/>
+            </w:tcMar>
+          </w:tcPr>
+          <w:p>
+            <w:pPr>
+              <w:keepNext/>
+              <w:spacing w:after="0"/>
+              <w:jc w:val="center"/>
+            </w:pPr>
+            <w:r>
+              <w:rPr>
+                <w:b/>
+                <w:color w:val="283848"/>
+                <w:sz w:val="17"/>
+              </w:rPr>
+              <w:t>Pegar apex_process.sql en el proceso de descarga</w:t>
+            </w:r>
+          </w:p>
+          <w:p>
+            <w:pPr>
+              <w:keepNext/>
+              <w:spacing w:after="0"/>
+              <w:jc w:val="center"/>
+            </w:pPr>
+            <w:r>
+              <w:rPr>
+                <w:sz w:val="15"/>
+              </w:rPr>
+              <w:t>el package se instala una sola vez por esquema</w:t>
+            </w:r>
+          </w:p>
+        </w:tc>
+      </w:tr>
+      <w:tr>
+        <w:trPr>
+          <w:cantSplit w:val="true"/>
+        </w:trPr>
+        <w:tc>
+          <w:tcPr>
+            <w:tcW w:type="dxa" w:w="1871"/>
+          </w:tcPr>
+          <w:p>
+            <w:pPr>
+              <w:keepNext/>
+            </w:pPr>
+          </w:p>
+        </w:tc>
+        <w:tc>
+          <w:tcPr>
+            <w:tcW w:type="dxa" w:w="6350"/>
+          </w:tcPr>
+          <w:p>
+            <w:pPr>
+              <w:keepNext/>
+              <w:spacing w:after="0" w:line="216" w:lineRule="auto"/>
+              <w:jc w:val="center"/>
+            </w:pPr>
+            <w:r>
+              <w:rPr>
+                <w:color w:val="4A5563"/>
+                <w:sz w:val="18"/>
+              </w:rPr>
+              <w:t>▼</w:t>
+            </w:r>
+          </w:p>
+        </w:tc>
+      </w:tr>
+      <w:tr>
+        <w:trPr>
+          <w:cantSplit w:val="true"/>
+        </w:trPr>
+        <w:tc>
+          <w:tcPr>
+            <w:tcW w:type="dxa" w:w="1871"/>
+            <w:vAlign w:val="center"/>
+            <w:tcMar>
+              <w:top w:w="40" w:type="dxa"/>
+              <w:start w:w="60" w:type="dxa"/>
+              <w:bottom w:w="40" w:type="dxa"/>
+              <w:end w:w="140" w:type="dxa"/>
+            </w:tcMar>
+          </w:tcPr>
+          <w:p>
+            <w:pPr>
+              <w:keepNext/>
+              <w:spacing w:after="0"/>
+              <w:jc w:val="right"/>
+            </w:pPr>
+            <w:r>
+              <w:rPr>
+                <w:rFonts w:ascii="Aptos" w:hAnsi="Aptos"/>
+                <w:b/>
+                <w:color w:val="4A5563"/>
+                <w:sz w:val="14"/>
+              </w:rPr>
+              <w:t>USUARIO FINAL</w:t>
+            </w:r>
+          </w:p>
+        </w:tc>
+        <w:tc>
+          <w:tcPr>
+            <w:tcW w:type="dxa" w:w="6350"/>
+            <w:vAlign w:val="center"/>
+            <w:shd w:fill="E8EDF2"/>
+            <w:tcBorders>
+              <w:top w:val="single" w:sz="8" w:space="0" w:color="283848"/>
+              <w:left w:val="single" w:sz="8" w:space="0" w:color="283848"/>
+              <w:bottom w:val="single" w:sz="8" w:space="0" w:color="283848"/>
+              <w:right w:val="single" w:sz="8" w:space="0" w:color="283848"/>
+            </w:tcBorders>
+            <w:tcMar>
+              <w:top w:w="70" w:type="dxa"/>
+              <w:start w:w="140" w:type="dxa"/>
+              <w:bottom w:w="70" w:type="dxa"/>
+              <w:end w:w="140" w:type="dxa"/>
+            </w:tcMar>
+          </w:tcPr>
+          <w:p>
+            <w:pPr>
+              <w:keepNext/>
+              <w:spacing w:after="0"/>
+              <w:jc w:val="center"/>
+            </w:pPr>
+            <w:r>
+              <w:rPr>
+                <w:b/>
+                <w:color w:val="283848"/>
+                <w:sz w:val="17"/>
+              </w:rPr>
+              <w:t>Descargar PDF o XLSX</w:t>
+            </w:r>
+          </w:p>
+          <w:p>
+            <w:pPr>
+              <w:keepNext/>
+              <w:spacing w:after="0"/>
+              <w:jc w:val="center"/>
+            </w:pPr>
+            <w:r>
+              <w:rPr>
+                <w:sz w:val="15"/>
+              </w:rPr>
+              <w:t>APEX_DATA_EXPORT genera el archivo en el servidor</w:t>
+            </w:r>
+          </w:p>
+        </w:tc>
+      </w:tr>
+    </w:tbl>
+    <w:p>
+      <w:pPr>
+        <w:spacing w:before="60"/>
+        <w:jc w:val="center"/>
+      </w:pPr>
+      <w:r>
+        <w:rPr>
+          <w:i/>
+          <w:color w:val="4A5563"/>
+          <w:sz w:val="16"/>
+        </w:rPr>
+        <w:t>Figura 1. Del Word a la descarga en APEX</w:t>
+      </w:r>
+    </w:p>
+    <w:p>
+      <w:r>
+        <w:t xml:space="preserve">Cada vez que cambia la plantilla Word basta con volver a compilar: </w:t>
+      </w:r>
+      <w:r>
+        <w:rPr>
+          <w:rFonts w:ascii="Consolas" w:hAnsi="Consolas"/>
+          <w:color w:val="233648"/>
+          <w:sz w:val="16"/>
+        </w:rPr>
+        <w:t>template.json</w:t>
+      </w:r>
+      <w:r>
+        <w:t xml:space="preserve"> y </w:t>
+      </w:r>
+      <w:r>
+        <w:rPr>
+          <w:rFonts w:ascii="Consolas" w:hAnsi="Consolas"/>
+          <w:color w:val="233648"/>
+          <w:sz w:val="16"/>
+        </w:rPr>
+        <w:t>apex_process.sql</w:t>
+      </w:r>
+      <w:r>
+        <w:t xml:space="preserve"> se regeneran automáticamente a partir del DOCX, el SQL y el </w:t>
+      </w:r>
+      <w:r>
+        <w:rPr>
+          <w:rFonts w:ascii="Consolas" w:hAnsi="Consolas"/>
+          <w:color w:val="233648"/>
+          <w:sz w:val="16"/>
+        </w:rPr>
+        <w:t>.report.json</w:t>
+      </w:r>
+      <w:r>
+        <w:t xml:space="preserve">. El </w:t>
+      </w:r>
+      <w:r>
+        <w:rPr>
+          <w:rFonts w:ascii="Consolas" w:hAnsi="Consolas"/>
+          <w:color w:val="233648"/>
+          <w:sz w:val="16"/>
+        </w:rPr>
+        <w:t>.report.json</w:t>
+      </w:r>
+      <w:r>
+        <w:t xml:space="preserve"> y el </w:t>
+      </w:r>
+      <w:r>
+        <w:rPr>
+          <w:rFonts w:ascii="Consolas" w:hAnsi="Consolas"/>
+          <w:color w:val="233648"/>
+          <w:sz w:val="16"/>
+        </w:rPr>
+        <w:t>.sql</w:t>
+      </w:r>
+      <w:r>
+        <w:t xml:space="preserve"> son archivos de texto que el usuario puede editar directamente en cualquier momento.</w:t>
+      </w:r>
+    </w:p>
+    <w:p>
       <w:pPr>
         <w:pStyle w:val="Heading1"/>
         <w:keepNext/>
@@ -412,13 +1486,7 @@
         <w:t>Compilador de reportes APEX</w:t>
       </w:r>
       <w:r>
-        <w:t xml:space="preserve"> (acceso directo de esta</w:t>
-      </w:r>
-      <w:r>
-        <w:t xml:space="preserve"> </w:t>
-      </w:r>
-      <w:r>
-        <w:t xml:space="preserve">carpeta) o en </w:t>
+        <w:t xml:space="preserve"> (acceso directo de esta carpeta) o en </w:t>
       </w:r>
       <w:r>
         <w:rPr>
@@ -438,16 +1506,7 @@
         <w:t>.venv</w:t>
       </w:r>
       <w:r>
-        <w:t xml:space="preserve"> </w:t>
-      </w:r>
-      <w:r>
-        <w:t>automáticamente; requiere Python 3.12 o superior. El acceso directo sigue</w:t>
-      </w:r>
-      <w:r>
-        <w:t xml:space="preserve"> </w:t>
-      </w:r>
-      <w:r>
-        <w:t>funcionando si la carpeta se mueve o se entrega comprimida.</w:t>
+        <w:t xml:space="preserve"> automáticamente; requiere Python 3.12 o superior. El acceso directo sigue funcionando si la carpeta se mueve o se entrega comprimida.</w:t>
       </w:r>
     </w:p>
     <w:p>
@@ -563,6 +1622,17 @@
                 <w:color w:val="233648"/>
                 <w:sz w:val="16"/>
               </w:rPr>
+              <w:t># Revisa DOCX + SQL + proyecto; no escribe nada en disco</w:t>
+            </w:r>
+            <w:r>
+              <w:br/>
+            </w:r>
+            <w:r>
+              <w:rPr>
+                <w:rFonts w:ascii="Consolas" w:hAnsi="Consolas"/>
+                <w:color w:val="233648"/>
+                <w:sz w:val="16"/>
+              </w:rPr>
               <w:t>apex-report-compiler validate `</w:t>
             </w:r>
             <w:r>
@@ -611,6 +1681,17 @@
               <w:keepLines/>
               <w:spacing w:after="0"/>
             </w:pPr>
+            <w:r>
+              <w:rPr>
+                <w:rFonts w:ascii="Consolas" w:hAnsi="Consolas"/>
+                <w:color w:val="233648"/>
+                <w:sz w:val="16"/>
+              </w:rPr>
+              <w:t># Genera build\entidades\template.json, validation.json y apex_process.sql</w:t>
+            </w:r>
+            <w:r>
+              <w:br/>
+            </w:r>
             <w:r>
               <w:rPr>
                 <w:rFonts w:ascii="Consolas" w:hAnsi="Consolas"/>
@@ -682,6 +1763,17 @@
                 <w:color w:val="233648"/>
                 <w:sz w:val="16"/>
               </w:rPr>
+              <w:t># Abre la ventana «Compilador de reportes APEX»</w:t>
+            </w:r>
+            <w:r>
+              <w:br/>
+            </w:r>
+            <w:r>
+              <w:rPr>
+                <w:rFonts w:ascii="Consolas" w:hAnsi="Consolas"/>
+                <w:color w:val="233648"/>
+                <w:sz w:val="16"/>
+              </w:rPr>
               <w:t>apex-report-compiler-gui</w:t>
             </w:r>
           </w:p>
@@ -701,16 +1793,7 @@
         <w:t>PXX_</w:t>
       </w:r>
       <w:r>
-        <w:t xml:space="preserve"> </w:t>
-      </w:r>
-      <w:r>
-        <w:t>mapeados a los marcadores del Word) y, al compilar, muestra exactamente qué</w:t>
-      </w:r>
-      <w:r>
-        <w:t xml:space="preserve"> </w:t>
-      </w:r>
-      <w:r>
-        <w:t>archivo subir a APEX, dónde pegarlo y qué Page Items crear.</w:t>
+        <w:t xml:space="preserve"> mapeados a los marcadores del Word) y, al compilar, muestra exactamente qué archivo subir a APEX, dónde pegarlo y qué Page Items crear.</w:t>
       </w:r>
     </w:p>
     <w:p>
@@ -744,6 +1827,17 @@
               <w:keepLines/>
               <w:spacing w:after="0"/>
             </w:pPr>
+            <w:r>
+              <w:rPr>
+                <w:rFonts w:ascii="Consolas" w:hAnsi="Consolas"/>
+                <w:color w:val="233648"/>
+                <w:sz w:val="16"/>
+              </w:rPr>
+              <w:t># Mismo comando validate usando el código de src\, sin instalar el paquete</w:t>
+            </w:r>
+            <w:r>
+              <w:br/>
+            </w:r>
             <w:r>
               <w:rPr>
                 <w:rFonts w:ascii="Consolas" w:hAnsi="Consolas"/>
@@ -838,13 +1932,34 @@
     </w:p>
     <w:p>
       <w:r>
-        <w:t>La compilación es transaccional: si la validación falla, no sustituye una</w:t>
+        <w:t xml:space="preserve">Los tres se generan automáticamente en cada compilación; no hay que escribirlos a mano. Pueden editarse directamente si hace falta, pero la siguiente compilación los reemplaza: los cambios permanentes se hacen en el DOCX, el </w:t>
       </w:r>
       <w:r>
-        <w:t xml:space="preserve"> </w:t>
+        <w:rPr>
+          <w:rFonts w:ascii="Consolas" w:hAnsi="Consolas"/>
+          <w:color w:val="233648"/>
+          <w:sz w:val="16"/>
+        </w:rPr>
+        <w:t>.sql</w:t>
       </w:r>
       <w:r>
-        <w:t>salida anterior válida.</w:t>
+        <w:t xml:space="preserve"> o el </w:t>
+      </w:r>
+      <w:r>
+        <w:rPr>
+          <w:rFonts w:ascii="Consolas" w:hAnsi="Consolas"/>
+          <w:color w:val="233648"/>
+          <w:sz w:val="16"/>
+        </w:rPr>
+        <w:t>.report.json</w:t>
+      </w:r>
+      <w:r>
+        <w:t>.</w:t>
+      </w:r>
+    </w:p>
+    <w:p>
+      <w:r>
+        <w:t>La compilación es transaccional: si la validación falla, se conserva intacta la última salida válida.</w:t>
       </w:r>
     </w:p>
     <w:p>
@@ -983,7 +2098,7 @@
     </w:p>
     <w:p>
       <w:r>
-        <w:t xml:space="preserve">El package conserva las operaciones anteriores </w:t>
+        <w:t xml:space="preserve">El proceso generado llama a la operación pública </w:t>
       </w:r>
       <w:r>
         <w:rPr>
@@ -991,32 +2106,7 @@
           <w:color w:val="233648"/>
           <w:sz w:val="16"/>
         </w:rPr>
-        <w:t>DOWNLOAD_IG</w:t>
-      </w:r>
-      <w:r>
-        <w:t xml:space="preserve"> y</w:t>
-      </w:r>
-      <w:r>
-        <w:t xml:space="preserve"> </w:t>
-      </w:r>
-      <w:r>
-        <w:rPr>
-          <w:rFonts w:ascii="Consolas" w:hAnsi="Consolas"/>
-          <w:color w:val="233648"/>
-          <w:sz w:val="16"/>
-        </w:rPr>
-        <w:t>DOWNLOAD_IG_PDF</w:t>
-      </w:r>
-      <w:r>
-        <w:t xml:space="preserve">; la nueva operación SQL declarativa es </w:t>
-      </w:r>
-      <w:r>
-        <w:rPr>
-          <w:rFonts w:ascii="Consolas" w:hAnsi="Consolas"/>
-          <w:color w:val="233648"/>
-          <w:sz w:val="16"/>
-        </w:rPr>
-        <w:t>DOWNLOAD_QUERY</w:t>
+        <w:t>PKG_CORPORATE_REPORTS.DOWNLOAD_QUERY</w:t>
       </w:r>
       <w:r>
         <w:t>.</w:t>
@@ -1216,6 +2306,37 @@
           <w:color w:val="233648"/>
           <w:sz w:val="16"/>
         </w:rPr>
+        <w:t>tools/doc_sources/</w:t>
+      </w:r>
+      <w:r>
+        <w:t xml:space="preserve">: fuentes de esta documentación; </w:t>
+      </w:r>
+      <w:r>
+        <w:rPr>
+          <w:rFonts w:ascii="Consolas" w:hAnsi="Consolas"/>
+          <w:color w:val="233648"/>
+          <w:sz w:val="16"/>
+        </w:rPr>
+        <w:t>python tools\build_documentation.py</w:t>
+      </w:r>
+      <w:r>
+        <w:t xml:space="preserve"> regenera todos los Word.</w:t>
+      </w:r>
+    </w:p>
+    <w:p>
+      <w:pPr>
+        <w:spacing w:after="60"/>
+        <w:ind w:left="369" w:hanging="255"/>
+      </w:pPr>
+      <w:r>
+        <w:t xml:space="preserve">• </w:t>
+      </w:r>
+      <w:r>
+        <w:rPr>
+          <w:rFonts w:ascii="Consolas" w:hAnsi="Consolas"/>
+          <w:color w:val="233648"/>
+          <w:sz w:val="16"/>
+        </w:rPr>
         <w:t>tests/</w:t>
       </w:r>
       <w:r>
@@ -1233,25 +2354,7 @@
     </w:p>
     <w:p>
       <w:r>
-        <w:t>La suite local verifica el compilador, la seguridad del DOCX, la generación</w:t>
-      </w:r>
-      <w:r>
-        <w:t xml:space="preserve"> </w:t>
-      </w:r>
-      <w:r>
-        <w:t>determinista y el contrato estático del package. No reemplaza la compilación</w:t>
-      </w:r>
-      <w:r>
-        <w:t xml:space="preserve"> </w:t>
-      </w:r>
-      <w:r>
-        <w:t>real contra las APIs instaladas de APEX ni una descarga PDF/XLSX en Oracle;</w:t>
-      </w:r>
-      <w:r>
-        <w:t xml:space="preserve"> </w:t>
-      </w:r>
-      <w:r>
-        <w:t>esas pruebas finales deben realizarse en la aplicación APEX 24.2.</w:t>
+        <w:t>La suite local verifica el compilador, la seguridad del DOCX, la generación determinista y el contrato estático del package. No reemplaza la compilación real contra las APIs instaladas de APEX ni una descarga PDF/XLSX en Oracle; esas pruebas finales deben realizarse en la aplicación APEX 24.2.</w:t>
       </w:r>
     </w:p>
     <w:sectPr>

</xml_diff>

<commit_message>
feat: per-DOCX project folders under proyectos/ with generado/ subfolder
</commit_message>
<xml_diff>
--- a/README.docx
+++ b/README.docx
@@ -383,7 +383,7 @@
           <w:color w:val="233648"/>
           <w:sz w:val="16"/>
         </w:rPr>
-        <w:t>examples/entidades.docx</w:t>
+        <w:t>proyectos/entidades/entidades.docx</w:t>
       </w:r>
       <w:r>
         <w:t>) usa los cinco tipos de marcador:</w:t>
@@ -694,7 +694,7 @@
               <w:rPr>
                 <w:sz w:val="15"/>
               </w:rPr>
-              <w:t>crea automáticamente &lt;nombre&gt;.report.json y &lt;nombre&gt;.sql</w:t>
+              <w:t>copia el Word a proyectos\&lt;nombre&gt;\ y crea automáticamente generado\&lt;nombre&gt;.sql y .report.json</w:t>
             </w:r>
           </w:p>
         </w:tc>
@@ -1158,7 +1158,7 @@
               <w:rPr>
                 <w:sz w:val="15"/>
               </w:rPr>
-              <w:t>genera automáticamente template.json, validation.json y apex_process.sql</w:t>
+              <w:t>genera automáticamente apex_process.sql junto al DOCX, y template.json y validation.json en la carpeta generado</w:t>
             </w:r>
           </w:p>
         </w:tc>
@@ -1644,7 +1644,7 @@
                 <w:color w:val="233648"/>
                 <w:sz w:val="16"/>
               </w:rPr>
-              <w:t xml:space="preserve">  --project .\examples\entidades.report.json</w:t>
+              <w:t xml:space="preserve">  --project .\proyectos\entidades\generado\entidades.report.json</w:t>
             </w:r>
           </w:p>
         </w:tc>
@@ -1687,7 +1687,7 @@
                 <w:color w:val="233648"/>
                 <w:sz w:val="16"/>
               </w:rPr>
-              <w:t># Genera build\entidades\template.json, validation.json y apex_process.sql</w:t>
+              <w:t># apex_process.sql -&gt; proyectos\entidades\ ; template.json y validation.json -&gt; generado\</w:t>
             </w:r>
             <w:r>
               <w:br/>
@@ -1709,7 +1709,61 @@
                 <w:color w:val="233648"/>
                 <w:sz w:val="16"/>
               </w:rPr>
-              <w:t xml:space="preserve">  --project .\examples\entidades.report.json `</w:t>
+              <w:t xml:space="preserve">  --project .\proyectos\entidades\generado\entidades.report.json</w:t>
+            </w:r>
+          </w:p>
+        </w:tc>
+      </w:tr>
+    </w:tbl>
+    <w:p>
+      <w:r>
+        <w:t xml:space="preserve">Cargar un Word propio (se copia a </w:t>
+      </w:r>
+      <w:r>
+        <w:rPr>
+          <w:rFonts w:ascii="Consolas" w:hAnsi="Consolas"/>
+          <w:color w:val="233648"/>
+          <w:sz w:val="16"/>
+        </w:rPr>
+        <w:t>proyectos\&lt;nombre&gt;\</w:t>
+      </w:r>
+      <w:r>
+        <w:t>):</w:t>
+      </w:r>
+    </w:p>
+    <w:tbl>
+      <w:tblPr>
+        <w:tblW w:type="auto" w:w="0"/>
+        <w:jc w:val="center"/>
+        <w:tblLook w:firstColumn="1" w:firstRow="1" w:lastColumn="0" w:lastRow="0" w:noHBand="0" w:noVBand="1" w:val="04A0"/>
+      </w:tblPr>
+      <w:tblGrid>
+        <w:gridCol w:w="9972"/>
+      </w:tblGrid>
+      <w:tr>
+        <w:tc>
+          <w:tcPr>
+            <w:tcW w:type="dxa" w:w="9972"/>
+            <w:shd w:fill="F5F7F9"/>
+            <w:tcMar>
+              <w:top w:w="100" w:type="dxa"/>
+              <w:start w:w="140" w:type="dxa"/>
+              <w:bottom w:w="100" w:type="dxa"/>
+              <w:end w:w="140" w:type="dxa"/>
+            </w:tcMar>
+          </w:tcPr>
+          <w:p>
+            <w:pPr>
+              <w:keepLines/>
+              <w:spacing w:after="0"/>
+            </w:pPr>
+            <w:r>
+              <w:rPr>
+                <w:rFonts w:ascii="Consolas" w:hAnsi="Consolas"/>
+                <w:color w:val="233648"/>
+                <w:sz w:val="16"/>
+              </w:rPr>
+              <w:t># Crea proyectos\ventas\ventas.docx y proyectos\ventas\generado\ventas.sql/.report.json</w:t>
             </w:r>
             <w:r>
               <w:br/>
@@ -1720,7 +1774,7 @@
                 <w:color w:val="233648"/>
                 <w:sz w:val="16"/>
               </w:rPr>
-              <w:t xml:space="preserve">  --output .\build\entidades</w:t>
+              <w:t>apex-report-compiler new --docx C:\Descargas\ventas.docx --page 42</w:t>
             </w:r>
           </w:p>
         </w:tc>
@@ -1782,7 +1836,18 @@
     </w:tbl>
     <w:p>
       <w:r>
-        <w:t xml:space="preserve">La interfaz puede crear un proyecto inicial desde un DOCX (Page Items </w:t>
+        <w:t xml:space="preserve">La interfaz puede crear un proyecto inicial desde un DOCX en </w:t>
+      </w:r>
+      <w:r>
+        <w:rPr>
+          <w:rFonts w:ascii="Consolas" w:hAnsi="Consolas"/>
+          <w:color w:val="233648"/>
+          <w:sz w:val="16"/>
+        </w:rPr>
+        <w:t>proyectos\&lt;nombre&gt;\</w:t>
+      </w:r>
+      <w:r>
+        <w:t xml:space="preserve"> (Page Items </w:t>
       </w:r>
       <w:r>
         <w:rPr>
@@ -1855,7 +1920,7 @@
                 <w:color w:val="233648"/>
                 <w:sz w:val="16"/>
               </w:rPr>
-              <w:t xml:space="preserve">  --project .\examples\entidades.report.json</w:t>
+              <w:t xml:space="preserve">  --project .\proyectos\entidades\generado\entidades.report.json</w:t>
             </w:r>
           </w:p>
         </w:tc>
@@ -1870,66 +1935,121 @@
         <w:t>Artefactos generados</w:t>
       </w:r>
     </w:p>
-    <w:p>
-      <w:pPr>
-        <w:spacing w:after="60"/>
-        <w:ind w:left="369" w:hanging="255"/>
-      </w:pPr>
-      <w:r>
-        <w:t xml:space="preserve">• </w:t>
-      </w:r>
-      <w:r>
-        <w:rPr>
-          <w:rFonts w:ascii="Consolas" w:hAnsi="Consolas"/>
-          <w:color w:val="233648"/>
-          <w:sz w:val="16"/>
-        </w:rPr>
-        <w:t>template.json</w:t>
-      </w:r>
-      <w:r>
-        <w:t>: interpretación canónica de la plantilla y configuración;</w:t>
-      </w:r>
-    </w:p>
-    <w:p>
-      <w:pPr>
-        <w:spacing w:after="60"/>
-        <w:ind w:left="369" w:hanging="255"/>
-      </w:pPr>
-      <w:r>
-        <w:t xml:space="preserve">• </w:t>
-      </w:r>
-      <w:r>
-        <w:rPr>
-          <w:rFonts w:ascii="Consolas" w:hAnsi="Consolas"/>
-          <w:color w:val="233648"/>
-          <w:sz w:val="16"/>
-        </w:rPr>
-        <w:t>validation.json</w:t>
-      </w:r>
-      <w:r>
-        <w:t>: diagnósticos reproducibles;</w:t>
-      </w:r>
-    </w:p>
-    <w:p>
-      <w:pPr>
-        <w:spacing w:after="60"/>
-        <w:ind w:left="369" w:hanging="255"/>
-      </w:pPr>
-      <w:r>
-        <w:t xml:space="preserve">• </w:t>
-      </w:r>
-      <w:r>
-        <w:rPr>
-          <w:rFonts w:ascii="Consolas" w:hAnsi="Consolas"/>
-          <w:color w:val="233648"/>
-          <w:sz w:val="16"/>
-        </w:rPr>
-        <w:t>apex_process.sql</w:t>
-      </w:r>
-      <w:r>
-        <w:t>: proceso PL/SQL listo para revisar y copiar en APEX.</w:t>
-      </w:r>
-    </w:p>
+    <w:tbl>
+      <w:tblPr>
+        <w:tblW w:type="auto" w:w="0"/>
+        <w:jc w:val="center"/>
+        <w:tblLook w:firstColumn="1" w:firstRow="1" w:lastColumn="0" w:lastRow="0" w:noHBand="0" w:noVBand="1" w:val="04A0"/>
+      </w:tblPr>
+      <w:tblGrid>
+        <w:gridCol w:w="9972"/>
+      </w:tblGrid>
+      <w:tr>
+        <w:tc>
+          <w:tcPr>
+            <w:tcW w:type="dxa" w:w="9972"/>
+            <w:shd w:fill="F5F7F9"/>
+            <w:tcMar>
+              <w:top w:w="100" w:type="dxa"/>
+              <w:start w:w="140" w:type="dxa"/>
+              <w:bottom w:w="100" w:type="dxa"/>
+              <w:end w:w="140" w:type="dxa"/>
+            </w:tcMar>
+          </w:tcPr>
+          <w:p>
+            <w:pPr>
+              <w:keepLines/>
+              <w:spacing w:after="0"/>
+            </w:pPr>
+            <w:r>
+              <w:rPr>
+                <w:rFonts w:ascii="Consolas" w:hAnsi="Consolas"/>
+                <w:color w:val="233648"/>
+                <w:sz w:val="16"/>
+              </w:rPr>
+              <w:t>proyectos\ventas\</w:t>
+            </w:r>
+            <w:r>
+              <w:br/>
+            </w:r>
+            <w:r>
+              <w:rPr>
+                <w:rFonts w:ascii="Consolas" w:hAnsi="Consolas"/>
+                <w:color w:val="233648"/>
+                <w:sz w:val="16"/>
+              </w:rPr>
+              <w:t xml:space="preserve">  ventas.docx            &lt;- plantilla</w:t>
+            </w:r>
+            <w:r>
+              <w:br/>
+            </w:r>
+            <w:r>
+              <w:rPr>
+                <w:rFonts w:ascii="Consolas" w:hAnsi="Consolas"/>
+                <w:color w:val="233648"/>
+                <w:sz w:val="16"/>
+              </w:rPr>
+              <w:t xml:space="preserve">  apex_process.sql       &lt;- proceso PL/SQL listo para revisar y copiar en APEX</w:t>
+            </w:r>
+            <w:r>
+              <w:br/>
+            </w:r>
+            <w:r>
+              <w:rPr>
+                <w:rFonts w:ascii="Consolas" w:hAnsi="Consolas"/>
+                <w:color w:val="233648"/>
+                <w:sz w:val="16"/>
+              </w:rPr>
+              <w:t xml:space="preserve">  generado\</w:t>
+            </w:r>
+            <w:r>
+              <w:br/>
+            </w:r>
+            <w:r>
+              <w:rPr>
+                <w:rFonts w:ascii="Consolas" w:hAnsi="Consolas"/>
+                <w:color w:val="233648"/>
+                <w:sz w:val="16"/>
+              </w:rPr>
+              <w:t xml:space="preserve">    ventas.sql           &lt;- consulta fuente (su texto queda dentro de apex_process.sql)</w:t>
+            </w:r>
+            <w:r>
+              <w:br/>
+            </w:r>
+            <w:r>
+              <w:rPr>
+                <w:rFonts w:ascii="Consolas" w:hAnsi="Consolas"/>
+                <w:color w:val="233648"/>
+                <w:sz w:val="16"/>
+              </w:rPr>
+              <w:t xml:space="preserve">    ventas.report.json   &lt;- proyecto: binds, campos, anchos, estilos</w:t>
+            </w:r>
+            <w:r>
+              <w:br/>
+            </w:r>
+            <w:r>
+              <w:rPr>
+                <w:rFonts w:ascii="Consolas" w:hAnsi="Consolas"/>
+                <w:color w:val="233648"/>
+                <w:sz w:val="16"/>
+              </w:rPr>
+              <w:t xml:space="preserve">    template.json        &lt;- interpretación canónica de la plantilla y configuración</w:t>
+            </w:r>
+            <w:r>
+              <w:br/>
+            </w:r>
+            <w:r>
+              <w:rPr>
+                <w:rFonts w:ascii="Consolas" w:hAnsi="Consolas"/>
+                <w:color w:val="233648"/>
+                <w:sz w:val="16"/>
+              </w:rPr>
+              <w:t xml:space="preserve">    validation.json      &lt;- diagnósticos reproducibles</w:t>
+            </w:r>
+          </w:p>
+        </w:tc>
+      </w:tr>
+    </w:tbl>
     <w:p>
       <w:r>
         <w:t xml:space="preserve">Los tres se generan automáticamente en cada compilación; no hay que escribirlos a mano. Pueden editarse directamente si hace falta, pero la siguiente compilación los reemplaza: los cambios permanentes se hacen en el DOCX, el </w:t>
@@ -2255,10 +2375,10 @@
           <w:color w:val="233648"/>
           <w:sz w:val="16"/>
         </w:rPr>
-        <w:t>examples/README.docx</w:t>
+        <w:t>proyectos/</w:t>
       </w:r>
       <w:r>
-        <w:t xml:space="preserve"> y </w:t>
+        <w:t xml:space="preserve">: una carpeta por reporte, con el mismo nombre que su DOCX. Junto al DOCX queda </w:t>
       </w:r>
       <w:r>
         <w:rPr>
@@ -2266,10 +2386,63 @@
           <w:color w:val="233648"/>
           <w:sz w:val="16"/>
         </w:rPr>
-        <w:t>examples/</w:t>
+        <w:t>apex_process.sql</w:t>
       </w:r>
       <w:r>
-        <w:t>: proyecto ejecutable y resultado esperado.</w:t>
+        <w:t xml:space="preserve"> (lo que se pega en APEX); el material de trabajo va en </w:t>
+      </w:r>
+      <w:r>
+        <w:rPr>
+          <w:rFonts w:ascii="Consolas" w:hAnsi="Consolas"/>
+          <w:color w:val="233648"/>
+          <w:sz w:val="16"/>
+        </w:rPr>
+        <w:t>generado/</w:t>
+      </w:r>
+      <w:r>
+        <w:t xml:space="preserve">. Volver a cargar un DOCX con el mismo nombre reemplaza solo esos archivos, con copias </w:t>
+      </w:r>
+      <w:r>
+        <w:rPr>
+          <w:rFonts w:ascii="Consolas" w:hAnsi="Consolas"/>
+          <w:color w:val="233648"/>
+          <w:sz w:val="16"/>
+        </w:rPr>
+        <w:t>.bak</w:t>
+      </w:r>
+      <w:r>
+        <w:t>; nada más se borra.</w:t>
+      </w:r>
+    </w:p>
+    <w:p>
+      <w:pPr>
+        <w:spacing w:after="60"/>
+        <w:ind w:left="369" w:hanging="255"/>
+      </w:pPr>
+      <w:r>
+        <w:t xml:space="preserve">• </w:t>
+      </w:r>
+      <w:r>
+        <w:rPr>
+          <w:rFonts w:ascii="Consolas" w:hAnsi="Consolas"/>
+          <w:color w:val="233648"/>
+          <w:sz w:val="16"/>
+        </w:rPr>
+        <w:t>proyectos/entidades/</w:t>
+      </w:r>
+      <w:r>
+        <w:t>: proyecto de ejemplo ejecutable; es el único que incluye además su documentación (</w:t>
+      </w:r>
+      <w:r>
+        <w:rPr>
+          <w:rFonts w:ascii="Consolas" w:hAnsi="Consolas"/>
+          <w:color w:val="233648"/>
+          <w:sz w:val="16"/>
+        </w:rPr>
+        <w:t>README.docx</w:t>
+      </w:r>
+      <w:r>
+        <w:t>).</w:t>
       </w:r>
     </w:p>
     <w:p>

</xml_diff>

<commit_message>
Implementación de dos modos: simple y layout
</commit_message>
<xml_diff>
--- a/README.docx
+++ b/README.docx
@@ -523,7 +523,7 @@
         <w:t>APEX_DATA_EXPORT</w:t>
       </w:r>
       <w:r>
-        <w:t>. También genera XLSX.</w:t>
+        <w:t>. También genera XLSX, que lleva solo la fila de títulos y los datos (sin título, usuario, fecha ni pie), listo para filtrar y analizar.</w:t>
       </w:r>
     </w:p>
     <w:p>
@@ -560,7 +560,7 @@
           <w:color w:val="233648"/>
           <w:sz w:val="16"/>
         </w:rPr>
-        <w:t>sql/prototipo_pdf</w:t>
+        <w:t>sql/modo_layout</w:t>
       </w:r>
       <w:r>
         <w:t xml:space="preserve">). Una consulta por archivo, como el Data Model de Oracle Reports. Ejemplo ficticio: </w:t>
@@ -2231,7 +2231,7 @@
           <w:color w:val="233648"/>
           <w:sz w:val="16"/>
         </w:rPr>
-        <w:t>sql/pkg_corporate_reports.sql</w:t>
+        <w:t>sql/modo_simple/pkg_corporate_reports.sql</w:t>
       </w:r>
       <w:r>
         <w:t xml:space="preserve"> en el </w:t>
@@ -2458,7 +2458,18 @@
         <w:t>sql/README.docx</w:t>
       </w:r>
       <w:r>
-        <w:t>: instalación y seguridad del package.</w:t>
+        <w:t xml:space="preserve">: qué contiene </w:t>
+      </w:r>
+      <w:r>
+        <w:rPr>
+          <w:rFonts w:ascii="Consolas" w:hAnsi="Consolas"/>
+          <w:color w:val="233648"/>
+          <w:sz w:val="16"/>
+        </w:rPr>
+        <w:t>sql/</w:t>
+      </w:r>
+      <w:r>
+        <w:t xml:space="preserve"> (los motores comunes de cada modo), instalación y seguridad.</w:t>
       </w:r>
     </w:p>
     <w:p>

</xml_diff>

<commit_message>
documentación en común para report simple y layout
</commit_message>
<xml_diff>
--- a/README.docx
+++ b/README.docx
@@ -383,7 +383,7 @@
           <w:color w:val="233648"/>
           <w:sz w:val="16"/>
         </w:rPr>
-        <w:t>proyectos/entidades/entidades.docx</w:t>
+        <w:t>proyectos/demo/entidades/entidades.docx</w:t>
       </w:r>
       <w:r>
         <w:t>) usa los cinco tipos de marcador:</w:t>
@@ -571,7 +571,7 @@
           <w:color w:val="233648"/>
           <w:sz w:val="16"/>
         </w:rPr>
-        <w:t>proyectos/estado_cuenta</w:t>
+        <w:t>proyectos/demo/estado_cuenta</w:t>
       </w:r>
       <w:r>
         <w:t>. Ver Manual de uso, sección 13.</w:t>
@@ -1744,7 +1744,7 @@
                 <w:color w:val="233648"/>
                 <w:sz w:val="16"/>
               </w:rPr>
-              <w:t xml:space="preserve">  --project .\proyectos\entidades\generado\entidades.report.json</w:t>
+              <w:t xml:space="preserve">  --project .\proyectos\demo\entidades\generado\entidades.report.json</w:t>
             </w:r>
           </w:p>
         </w:tc>
@@ -1787,7 +1787,7 @@
                 <w:color w:val="233648"/>
                 <w:sz w:val="16"/>
               </w:rPr>
-              <w:t># apex_process.sql -&gt; proyectos\entidades\ ; template.json y validation.json -&gt; generado\</w:t>
+              <w:t># apex_process.sql -&gt; proyectos\demo\entidades\ ; template.json y validation.json -&gt; generado\</w:t>
             </w:r>
             <w:r>
               <w:br/>
@@ -1809,7 +1809,7 @@
                 <w:color w:val="233648"/>
                 <w:sz w:val="16"/>
               </w:rPr>
-              <w:t xml:space="preserve">  --project .\proyectos\entidades\generado\entidades.report.json</w:t>
+              <w:t xml:space="preserve">  --project .\proyectos\demo\entidades\generado\entidades.report.json</w:t>
             </w:r>
           </w:p>
         </w:tc>
@@ -2020,7 +2020,7 @@
                 <w:color w:val="233648"/>
                 <w:sz w:val="16"/>
               </w:rPr>
-              <w:t xml:space="preserve">  --project .\proyectos\entidades\generado\entidades.report.json</w:t>
+              <w:t xml:space="preserve">  --project .\proyectos\demo\entidades\generado\entidades.report.json</w:t>
             </w:r>
           </w:p>
         </w:tc>
@@ -2539,10 +2539,10 @@
           <w:color w:val="233648"/>
           <w:sz w:val="16"/>
         </w:rPr>
-        <w:t>proyectos/entidades/</w:t>
+        <w:t>proyectos/demo/</w:t>
       </w:r>
       <w:r>
-        <w:t>: proyecto de ejemplo ejecutable; es el único que incluye además su documentación (</w:t>
+        <w:t xml:space="preserve">: proyectos de demostración ejecutables, uno por modo: </w:t>
       </w:r>
       <w:r>
         <w:rPr>
@@ -2550,10 +2550,32 @@
           <w:color w:val="233648"/>
           <w:sz w:val="16"/>
         </w:rPr>
-        <w:t>README.docx</w:t>
+        <w:t>entidades</w:t>
       </w:r>
       <w:r>
-        <w:t>).</w:t>
+        <w:t xml:space="preserve"> (modo simple, página 70) y </w:t>
+      </w:r>
+      <w:r>
+        <w:rPr>
+          <w:rFonts w:ascii="Consolas" w:hAnsi="Consolas"/>
+          <w:color w:val="233648"/>
+          <w:sz w:val="16"/>
+        </w:rPr>
+        <w:t>estado_cuenta</w:t>
+      </w:r>
+      <w:r>
+        <w:t xml:space="preserve"> (modo layout, página 71). Su guía es </w:t>
+      </w:r>
+      <w:r>
+        <w:rPr>
+          <w:rFonts w:ascii="Consolas" w:hAnsi="Consolas"/>
+          <w:color w:val="233648"/>
+          <w:sz w:val="16"/>
+        </w:rPr>
+        <w:t>proyectos/demo/README.docx</w:t>
+      </w:r>
+      <w:r>
+        <w:t>.</w:t>
       </w:r>
     </w:p>
     <w:p>

</xml_diff>